<commit_message>
Align monthly lead remuneration and pilot funding in USD
</commit_message>
<xml_diff>
--- a/assets/venture-layer-white-paper.docx
+++ b/assets/venture-layer-white-paper.docx
@@ -87,7 +87,7 @@
       <w:r>
         <w:t>Venture Layer White Paper · Розділи 01–10</w:t>
         <w:br/>
-        <w:t>Початкова дата — 3 вересня 2026 року · Актуальна редакція — 15 жовтня 2026 року</w:t>
+        <w:t>Початкова дата — 3 вересня 2026 року · Актуальна редакція — 26 жовтня 2026 року</w:t>
       </w:r>
     </w:p>
     <w:p>
@@ -4927,7 +4927,7 @@
         <w:spacing w:after="80" w:line="264" w:lineRule="auto"/>
       </w:pPr>
       <w:r>
-        <w:t>Рішення про бонус містить зіставлення погоджених умов із фактичним результатом. Змінювати умови після отримання результатів не допускається. Командний бонус розподіляється між Venture Leads пропорційно часу виконання мандата в цьому періоді.</w:t>
+        <w:t>Рішення про бонус містить зіставлення погоджених умов із фактичним результатом. Змінювати умови після отримання результатів не допускається. Командний бонус нараховується кожному Venture Lead пропорційно часу виконання мандата в цьому періоді.</w:t>
       </w:r>
     </w:p>
     <w:p>
@@ -7520,7 +7520,7 @@
               <w:spacing w:after="40"/>
             </w:pPr>
             <w:r>
-              <w:t>Проміжний розбір результатів, рішень і розривів; оцінювання й поновлення мандатів до їхнього закінчення; перший командний бонус; практична готовність Fellows.</w:t>
+              <w:t>Проміжний розбір результатів, рішень і розривів; оцінювання й поновлення мандатів до їхнього закінчення; практична готовність Fellows.</w:t>
             </w:r>
           </w:p>
         </w:tc>
@@ -7626,7 +7626,7 @@
               <w:spacing w:after="40"/>
             </w:pPr>
             <w:r>
-              <w:t>Зафіксувати стан усіх прийнятих позицій; підсумковий розбір, перегляд мандатів, другий командний бонус і рішення Board.</w:t>
+              <w:t>Зафіксувати стан усіх прийнятих позицій; підсумковий розбір, перегляд мандатів і рішення Board.</w:t>
             </w:r>
           </w:p>
         </w:tc>
@@ -7907,7 +7907,7 @@
               <w:spacing w:after="40"/>
             </w:pPr>
             <w:r>
-              <w:t xml:space="preserve">Сума b, основний фонд і резерв виплат; платник і графік виплат — за </w:t>
+              <w:t xml:space="preserve">Основний фонд і резерв виплат; платник і графік виплат — за </w:t>
             </w:r>
             <w:hyperlink w:anchor="VL_07_finance" w:history="1">
               <w:r>
@@ -7931,7 +7931,7 @@
               </w:r>
             </w:hyperlink>
             <w:r>
-              <w:t xml:space="preserve">.</w:t>
+              <w:t>.</w:t>
             </w:r>
           </w:p>
         </w:tc>
@@ -8614,7 +8614,7 @@
         <w:pStyle w:val="V3Body"/>
       </w:pPr>
       <w:r>
-        <w:t>b — місячний фіксований бонус одного Lead. Стартовий розрахунок передбачає трьох Leads з однаковою базою впродовж шести календарних місяців, один із яких є Managing Venture Lead.</w:t>
+        <w:t>Розрахунок у доларах США (USD) передбачає трьох Venture Leads упродовж шести календарних місяців, один із яких є Managing Venture Lead. Фіксований щомісячний бонус одного Lead становить $400, надбавка Managing Venture Lead за координаційні обов’язки — $200 на місяць.</w:t>
       </w:r>
     </w:p>
     <w:tbl>
@@ -8678,7 +8678,7 @@
               <w:spacing w:after="40"/>
             </w:pPr>
             <w:r>
-              <w:t>Розрахунок</w:t>
+              <w:t>На місяць</w:t>
             </w:r>
           </w:p>
         </w:tc>
@@ -8695,7 +8695,7 @@
               <w:spacing w:after="40"/>
             </w:pPr>
             <w:r>
-              <w:t>За основний період</w:t>
+              <w:t>За шість місяців</w:t>
             </w:r>
           </w:p>
         </w:tc>
@@ -8716,7 +8716,7 @@
               <w:spacing w:after="40"/>
             </w:pPr>
             <w:r>
-              <w:t>Фіксовані бонуси</w:t>
+              <w:t>Фіксовані бонуси Leads</w:t>
             </w:r>
           </w:p>
         </w:tc>
@@ -8732,7 +8732,7 @@
               <w:spacing w:after="40"/>
             </w:pPr>
             <w:r>
-              <w:t>3b щомісяця</w:t>
+              <w:t>3 × $400 = $1 200</w:t>
             </w:r>
           </w:p>
         </w:tc>
@@ -8748,7 +8748,7 @@
               <w:spacing w:after="40"/>
             </w:pPr>
             <w:r>
-              <w:t>18b</w:t>
+              <w:t>$7 200</w:t>
             </w:r>
           </w:p>
         </w:tc>
@@ -8769,7 +8769,7 @@
               <w:spacing w:after="40"/>
             </w:pPr>
             <w:r>
-              <w:t>Доплата Managing Venture Lead</w:t>
+              <w:t>Надбавка Managing Venture Lead</w:t>
             </w:r>
           </w:p>
         </w:tc>
@@ -8785,7 +8785,7 @@
               <w:spacing w:after="40"/>
             </w:pPr>
             <w:r>
-              <w:t>0,2b щомісяця</w:t>
+              <w:t>$200</w:t>
             </w:r>
           </w:p>
         </w:tc>
@@ -8801,7 +8801,7 @@
               <w:spacing w:after="40"/>
             </w:pPr>
             <w:r>
-              <w:t>1,2b</w:t>
+              <w:t>$1 200</w:t>
             </w:r>
           </w:p>
         </w:tc>
@@ -8822,7 +8822,7 @@
               <w:spacing w:after="40"/>
             </w:pPr>
             <w:r>
-              <w:t>Командний фонд</w:t>
+              <w:t>Командний бонус за спільний показник</w:t>
             </w:r>
           </w:p>
         </w:tc>
@@ -8838,7 +8838,7 @@
               <w:spacing w:after="40"/>
             </w:pPr>
             <w:r>
-              <w:t>20% базових бонусів трьох Leads за квартал: 0,2 × 9b = 1,8b</w:t>
+              <w:t>До 3 × $200 = $600</w:t>
             </w:r>
           </w:p>
         </w:tc>
@@ -8854,7 +8854,7 @@
               <w:spacing w:after="40"/>
             </w:pPr>
             <w:r>
-              <w:t>3,6b за два періоди</w:t>
+              <w:t>До $3 600</w:t>
             </w:r>
           </w:p>
         </w:tc>
@@ -8891,7 +8891,7 @@
               <w:spacing w:after="40"/>
             </w:pPr>
             <w:r>
-              <w:t>Без податків і резерву завершення</w:t>
+              <w:t>$1 400 фіксовано; до $2 000 із командним бонусом</w:t>
             </w:r>
           </w:p>
         </w:tc>
@@ -8907,7 +8907,7 @@
               <w:spacing w:after="40"/>
             </w:pPr>
             <w:r>
-              <w:t>22,8b</w:t>
+              <w:t>$8 400 фіксовано; до $12 000 із командним бонусом</w:t>
             </w:r>
           </w:p>
         </w:tc>
@@ -8924,7 +8924,7 @@
         <w:pStyle w:val="V3Body"/>
       </w:pPr>
       <w:r>
-        <w:t xml:space="preserve">Для кожного тримісячного періоду застосовуються наперед погоджені умови командного бонусу за підрозділом </w:t>
+        <w:t>За досягнення спільного показника кожному Venture Lead нараховується додатковий командний бонус $200 за відповідний місяць. Supervisory Board визначає показник та умови його оцінювання до початку періоду за підрозділом «</w:t>
       </w:r>
       <w:hyperlink w:anchor="VL_04_reward" w:history="1">
         <w:r>
@@ -8936,7 +8936,7 @@
         </w:r>
       </w:hyperlink>
       <w:r>
-        <w:t xml:space="preserve">. Орієнтир двох go G3 не є квотою для його нарахування.</w:t>
+        <w:t>». Орієнтир двох go G3 не є квотою для нарахування бонусу.</w:t>
       </w:r>
     </w:p>
     <w:p>
@@ -8944,7 +8944,7 @@
         <w:pStyle w:val="V3Body"/>
       </w:pPr>
       <w:r>
-        <w:t>За заміни людей розрахунок спирається на дати чинних мандатів. Неповні місяці й зміни складу оплачуються за погодженими умовами виплат. Формула 22,8b стосується стартового складу; підсумок показує фактичні нарахування, виплати та зобов’язання.</w:t>
+        <w:t>Фактичний фонд залежить від кількості місяців, за які нараховано командний бонус. За заміни людей розрахунок спирається на дати чинних мандатів; неповні місяці оплачуються за погодженими умовами виплат. Підсумок показує фактичні нарахування, виплати та зобов’язання. Податки й резерв завершення визначаються окремо.</w:t>
       </w:r>
     </w:p>
     <w:p>
@@ -13403,6 +13403,22 @@
       </w:pPr>
       <w:r>
         <w:t>З G2 вилучено окреме застереження щодо кола знайомих ініціатора. Вимогу підтвердження проблеми в цільовому сегменті та інші положення G2 збережено.</w:t>
+      </w:r>
+    </w:p>
+    <w:p>
+      <w:pPr>
+        <w:pStyle w:val="V3Heading"/>
+      </w:pPr>
+      <w:r>
+        <w:t>Запис 52 · 26 жовтня 2026 року · Щомісячна винагорода Venture Leads</w:t>
+      </w:r>
+    </w:p>
+    <w:p>
+      <w:pPr>
+        <w:pStyle w:val="V3Body"/>
+      </w:pPr>
+      <w:r>
+        <w:t>Погоджено $400 фіксованого бонусу на місяць кожному Lead, додаткові $200 кожному за місяць досягнення спільного показника та надбавку Managing Venture Lead $200 на місяць. Для трьох Leads за шість місяців фіксована частина становить $8 400, максимальний фонд із командним бонусом за всі шість місяців — $12 000. Оновлено календар і розрахунки; попередня формула 22,8b зберігається лише в історичних записах.</w:t>
       </w:r>
     </w:p>
     <w:sectPr>

</xml_diff>